<commit_message>
Remove em dashes and other AI-writing tells from the new prose
None of the manuscript, cover letter, or README text I wrote for the
reframe had been run through a humanizer pass. Found and fixed 21 em
dashes I introduced (replaced with periods, commas, colons, or actual
parentheses depending on context), plus 2 pre-existing ones caught in
the same sweep, plus one class-name inconsistency ("Web Attack -- Brute
Force" now matches the document's own hyphen convention used elsewhere).
Also fixed two README claims that overstated the explanation-consistency
check as "ensuring" reliable results, which the reframed paper's own
findings now contradict.

3 em dashes remain, all legitimate blank-cell markers in the pre-existing
Table 4 (McNemar tests), not prose.
</commit_message>
<xml_diff>
--- a/manuscript/manuscript.docx
+++ b/manuscript/manuscript.docx
@@ -193,7 +193,7 @@
         <w:jc w:val="both"/>
       </w:pPr>
       <w:r>
-        <w:t>As network infrastructures evolve toward Industry 5.0 and the Internet of Things, the attack surface available to malicious actors continues to expand. Signature-based intrusion detection is increasingly inadequate against attacks (distributed denial-of-service campaigns, brute-force credential attacks, and encrypted web exploits) that are progressively harder to distinguish from benign traffic, and machine learning has become the primary defensive mechanism. In operational deployments the model’s output is consumed twice over: a security operations centre (SOC) acts on the alert, and increasingly also on an explanation of it, which steers triage, escalation, and response. Post-hoc explainers such as SHAP are now routinely attached to NIDS for this purpose, but their attributions are approximations, and recent surveys note that almost no NIDS work attempts any consistency check on them (Neupane et al. 2022; Mohale and Obagbuwa 2025). Where checks do exist, they compare two post-hoc approximations against each other — and agreement between two approximations cannot rule out a shared approximation artefact, only a shared reference that is exact by construction can. This raises a question that, to our knowledge, has been assumed rather than tested anywhere in this literature: does agreement between a post-hoc explainer and an exact reference actually predict anything an operator cares about — that a prediction is correct, or that an alert deserves scrutiny — or does it merely look reassuring without being actionable?</w:t>
+        <w:t>As network infrastructures evolve toward Industry 5.0 and the Internet of Things, the attack surface available to malicious actors continues to expand. Signature-based intrusion detection is increasingly inadequate against attacks (distributed denial-of-service campaigns, brute-force credential attacks, and encrypted web exploits) that are progressively harder to distinguish from benign traffic, and machine learning has become the primary defensive mechanism. In operational deployments the model’s output is consumed twice over: a security operations centre (SOC) acts on the alert, and increasingly also on an explanation of it, which steers triage, escalation, and response. Post-hoc explainers such as SHAP are now routinely attached to NIDS for this purpose, but their attributions are approximations, and recent surveys note that almost no NIDS work attempts any consistency check on them (Neupane et al. 2022; Mohale and Obagbuwa 2025). Where checks do exist, they compare two post-hoc approximations against each other, and that agreement cannot rule out a shared approximation artefact. Only a shared reference that is exact by construction can. This raises a question that, to our knowledge, has been assumed rather than tested anywhere in this literature: does agreement between a post-hoc explainer and an exact reference actually predict anything an operator cares about: that a prediction is correct, or that an alert deserves scrutiny, or does it merely look reassuring without being actionable?</w:t>
       </w:r>
     </w:p>
     <w:p>
@@ -202,7 +202,7 @@
         <w:jc w:val="both"/>
       </w:pPr>
       <w:r>
-        <w:t>Answering this question requires an exact reference that costs nothing extra to obtain. We build one by embedding a glass-box model, the Explainable Boosting Machine (EBM), whose feature attributions follow analytically from its structure, as a base learner inside a heterogeneous stacked ensemble alongside CatBoost and ExtraTrees. This is an engineering decision, not a new learning algorithm, and it has a second benefit independent of the explanation question: the three learning paradigms’ diversity restores genuine ensemble gains where a homogeneous soft-voted XGBoost, LightGBM, and Random Forest ensemble fails to beat standalone LightGBM (Section 4.1) — a second, separate weakness in the field’s dominant ensembling recipe that we document alongside the main test.</w:t>
+        <w:t>Answering this question requires an exact reference that costs nothing extra to obtain. We build one by embedding a glass-box model, the Explainable Boosting Machine (EBM), whose feature attributions follow analytically from its structure, as a base learner inside a heterogeneous stacked ensemble alongside CatBoost and ExtraTrees. This is an engineering decision, not a new learning algorithm, and it has a second benefit independent of the explanation question: the three learning paradigms’ diversity restores genuine ensemble gains where a homogeneous soft-voted XGBoost, LightGBM, and Random Forest ensemble fails to beat standalone LightGBM (Section 4.1). This is a second, separate weakness in the field’s dominant ensembling recipe that we document alongside the main test.</w:t>
       </w:r>
     </w:p>
     <w:p>
@@ -227,7 +227,7 @@
         <w:t xml:space="preserve">Contributions. </w:t>
       </w:r>
       <w:r>
-        <w:t xml:space="preserve">(i) The first rigorous empirical test, to our knowledge, of whether cross-model explanation agreement — measured against an exact, deployed, glass-box reference rather than a second post-hoc approximation — functions as an operational trust signal, evaluated with a paired confidence baseline, DeLong-tested AUROC comparisons, cross-validated incremental discrimination, and bootstrap confidence intervals (Sections 4.5.3–4.5.4); (ii) a four-class, two-dataset replication design showing the result is not stable across held-out attack types or benchmarks, itself evidence against treating explanation-consistency as a general-purpose deployable property (Sections 4.5.3–4.5.4); (iii) the engineering enabler: a NIDS architecture embedding an exact glass-box model as a base learner inside a heterogeneous stacked ensemble, making the reference a deployed, load-bearing component rather than an offline surrogate, at no additional inference cost (Section 3.4); (iv) an independent demonstration that a homogeneous boosted voting ensemble fails to beat its best member on CICIDS-2017, while paradigm diversity combined by stacking restores genuine ensemble gains (Sections 3.4.1 and 4.1); (v) a documented structural limitation of CICIDS-2017 — every attack type occurs on exactly one collection day, precluding naive temporal-split evaluation — and a documented refit-sensitivity property of single-point explanation-agreement estimates, both of direct relevance to future work using this benchmark or this class of metric (Sections 4.5 and 5); (vi) an operational deployment layer independent of the explanation-signal question: SOC-aware per-class threshold calibration tuned leak-free on real-prevalence data, at microsecond-scale parallel inference (Sections 3.5, 4.4, and 4.6); and (vii) an evaluation protocol in which every model comparison shares identical folds and base fits, making all McNemar tests properly paired, the statistical foundation the above contributions rest on.</w:t>
+        <w:t xml:space="preserve">(i) The first rigorous empirical test, to our knowledge, of whether cross-model explanation agreement (measured against an exact, deployed, glass-box reference rather than a second post-hoc approximation) functions as an operational trust signal, evaluated with a paired confidence baseline, DeLong-tested AUROC comparisons, cross-validated incremental discrimination, and bootstrap confidence intervals (Sections 4.5.3–4.5.4); (ii) a four-class, two-dataset replication design showing the result is not stable across held-out attack types or benchmarks, itself evidence against treating explanation-consistency as a general-purpose deployable property (Sections 4.5.3–4.5.4); (iii) the engineering enabler: a NIDS architecture embedding an exact glass-box model as a base learner inside a heterogeneous stacked ensemble, making the reference a deployed, load-bearing component rather than an offline surrogate, at no additional inference cost (Section 3.4); (iv) an independent demonstration that a homogeneous boosted voting ensemble fails to beat its best member on CICIDS-2017, while paradigm diversity combined by stacking restores genuine ensemble gains (Sections 3.4.1 and 4.1); (v) a documented structural limitation of CICIDS-2017 (every attack type occurs on exactly one collection day, precluding naive temporal-split evaluation) and a documented refit-sensitivity property of single-point explanation-agreement estimates, both of direct relevance to future work using this benchmark or this class of metric (Sections 4.5 and 5); (vi) an operational deployment layer independent of the explanation-signal question: SOC-aware per-class threshold calibration tuned leak-free on real-prevalence data, at microsecond-scale parallel inference (Sections 3.5, 4.4, and 4.6); and (vii) an evaluation protocol in which every model comparison shares identical folds and base fits, making all McNemar tests properly paired, the statistical foundation the above contributions rest on.</w:t>
       </w:r>
     </w:p>
     <w:p>
@@ -1666,7 +1666,7 @@
         <w:jc w:val="both"/>
       </w:pPr>
       <w:r>
-        <w:t>To the best of our knowledge, no prior NIDS work (a) embeds an exact glass-box model as a stacked base learner at no additional inference cost, or (b) tests — rather than asserts — whether agreement between a post-hoc explainer and an exact reference predicts anything an operator would act on, using a baseline and statistical comparison adequate to distinguish a real effect from a plausible-looking correlation. The recent systems surveyed in Section 2.1 sharpen rather than close this second gap: explanations are attached, benchmarked against one another, or used to guide training, but their fidelity to the underlying model, or their value as a trust signal, is asserted from plausibility rather than measured against a confidence baseline with proper statistics. This work closes both gaps, and reports the result of the second test honestly: the embedded exact reference is a real engineering capability, but the trust-signal claim it enables does not survive the rigorous test we subject it to, across two scenarios, four held-out classes, and two benchmark datasets. We treat this as the paper’s central empirical contribution rather than a disappointing footnote, consistent with a growing recognition in adjacent ML fields that a well-tested negative result correcting an unverified assumption is a more durable contribution than an unverified positive claim.</w:t>
+        <w:t>To the best of our knowledge, no prior NIDS work (a) embeds an exact glass-box model as a stacked base learner at no additional inference cost, or (b) tests, rather than asserts, whether agreement between a post-hoc explainer and an exact reference predicts anything an operator would act on, using a baseline and statistical comparison adequate to distinguish a real effect from a plausible-looking correlation. The recent systems surveyed in Section 2.1 sharpen rather than close this second gap: explanations are attached, benchmarked against one another, or used to guide training, but their fidelity to the underlying model, or their value as a trust signal, is asserted from plausibility rather than measured against a confidence baseline with proper statistics. This work closes both gaps, and reports the result of the second test honestly: the embedded exact reference is a real engineering capability, but the trust-signal claim it enables does not survive the rigorous test we subject it to, across two scenarios, four held-out classes, and two benchmark datasets. We treat this as the paper’s central empirical contribution rather than a disappointing footnote, consistent with a growing recognition in adjacent ML fields that a well-tested negative result correcting an unverified assumption is a more durable contribution than an unverified positive claim.</w:t>
       </w:r>
     </w:p>
     <w:p>
@@ -12316,7 +12316,7 @@
         <w:jc w:val="both"/>
       </w:pPr>
       <w:r>
-        <w:t xml:space="preserve">One further caveat applies to any single point estimate of this kind: an independent refit of the final-fold ensemble, using identical hyperparameters, random seeds, and code, reproduced the classification-performance numbers of Table 3 almost exactly (accuracy 0.9983 vs. 99.83% reported, weighted-F1 0.9984 vs. 0.9984, MCC 0.9952 vs. 0.9951) but gave a materially different Spearman ρ for the SHAP-EBM agreement (0.851 vs. 0.775 above), a gap not explained by background-sampling variance alone (a 2,000-resample bootstrap over the reported background gives a 95% CI of [0.827, 0.864], which does not contain either single-refit value against the other). CatBoost's multi-threaded training is not guaranteed bit-reproducible under a fixed seed, and the discrepancy is consistent with that. Explanation-agreement metrics of this kind should therefore be reported as a range across several independent refits, not a single point estimate — a stricter standard than classification-performance metrics require, since the latter proved stable under the same refit.</w:t>
+        <w:t xml:space="preserve">One further caveat applies to any single point estimate of this kind: an independent refit of the final-fold ensemble, using identical hyperparameters, random seeds, and code, reproduced the classification-performance numbers of Table 3 almost exactly (accuracy 0.9983 vs. 99.83% reported, weighted-F1 0.9984 vs. 0.9984, MCC 0.9952 vs. 0.9951) but gave a materially different Spearman ρ for the SHAP-EBM agreement (0.851 vs. 0.775 above), a gap not explained by background-sampling variance alone (a 2,000-resample bootstrap over the reported background gives a 95% CI of [0.827, 0.864], which does not contain either single-refit value against the other). CatBoost's multi-threaded training is not guaranteed bit-reproducible under a fixed seed, and the discrepancy is consistent with that. Explanation-agreement metrics of this kind should therefore be reported as a range across several independent refits, not a single point estimate. This is a stricter standard than classification-performance metrics require, since the latter proved stable under the same refit.</w:t>
       </w:r>
     </w:p>
     <w:p>
@@ -12596,7 +12596,7 @@
         <w:jc w:val="both"/>
       </w:pPr>
       <w:r>
-        <w:t xml:space="preserve">Table 8's agreement metrics are computed on a background drawn at real class prevalence, dominated by BENIGN traffic (Section 3.6). To test whether agreement specifically degrades on the minority attack classes an analyst actually triages, we recomputed the full Table 8 protocol on a class-stratified background (up to 150 flows per class) and bootstrapped a 95% confidence interval per class (2,000 resamples). Agreement does not collapse on rare classes: Spearman ρ ranges from 0.714 (DDoS) to 0.895 (DoS Slowhttptest) across all twelve classes, and BENIGN sits mid-distribution (ρ = 0.845) rather than anchoring the high end. The DDoS and DoS Slowhttptest confidence intervals ([0.699, 0.725] and [0.878, 0.911] respectively) do not overlap, so this spread is a genuine, statistically distinguishable property of the classes rather than sampling noise — but it does not track class rarity or prevalence in any simple way. We are unable to identify a feature-space explanation for why DDoS specifically shows the weakest agreement and leave this as an open question.</w:t>
+        <w:t xml:space="preserve">Table 8's agreement metrics are computed on a background drawn at real class prevalence, dominated by BENIGN traffic (Section 3.6). To test whether agreement specifically degrades on the minority attack classes an analyst actually triages, we recomputed the full Table 8 protocol on a class-stratified background (up to 150 flows per class) and bootstrapped a 95% confidence interval per class (2,000 resamples). Agreement does not collapse on rare classes: Spearman ρ ranges from 0.714 (DDoS) to 0.895 (DoS Slowhttptest) across all twelve classes, and BENIGN sits mid-distribution (ρ = 0.845) rather than anchoring the high end. The DDoS and DoS Slowhttptest confidence intervals ([0.699, 0.725] and [0.878, 0.911] respectively) do not overlap, so this spread is a genuine, statistically distinguishable property of the classes rather than sampling noise, but it does not track class rarity or prevalence in any simple way. We are unable to identify a feature-space explanation for why DDoS specifically shows the weakest agreement and leave this as an open question.</w:t>
       </w:r>
     </w:p>
     <w:p>
@@ -12622,7 +12622,7 @@
         <w:jc w:val="both"/>
       </w:pPr>
       <w:r>
-        <w:t xml:space="preserve">Per-alert error prediction. Restricting a 6,000-flow evaluation sample to the fold-5 held-out partition and oversampling to include all 184 true misclassifications found there (against 8,000 correctly classified flows, error prevalence raised to 2.25% purely for estimation power — AUROC is prevalence-invariant, so this does not bias the comparison), divergence alone predicts error markedly worse than chance (AUROC 0.378 cosine, 0.296 Jensen-Shannon) while confidence predicts it well (AUROC 0.977; DeLong z = −32.2, p ≈ 0). This is explained in part by a genuine, if modest, positive correlation between confidence and divergence themselves (Spearman ρ = 0.11–0.24, p &lt; 10⁻²⁴): population-level “divergence anti-correlated with error” is largely a byproduct of divergence tracking confidence's own strong inverse relationship with error, not an independent signal.</w:t>
+        <w:t xml:space="preserve">Per-alert error prediction. Restricting a 6,000-flow evaluation sample to the fold-5 held-out partition and oversampling to include all 184 true misclassifications found there (against 8,000 correctly classified flows, error prevalence raised to 2.25% purely for estimation power (AUROC is prevalence-invariant, so this does not bias the comparison), divergence alone predicts error markedly worse than chance (AUROC 0.378 cosine, 0.296 Jensen-Shannon) while confidence predicts it well (AUROC 0.977; DeLong z = −32.2, p ≈ 0). This is explained in part by a genuine, if modest, positive correlation between confidence and divergence themselves (Spearman ρ = 0.11–0.24, p &lt; 10⁻²⁴): population-level “divergence anti-correlated with error” is largely a byproduct of divergence tracking confidence's own strong inverse relationship with error, not an independent signal.</w:t>
       </w:r>
     </w:p>
     <w:p>
@@ -12631,7 +12631,7 @@
         <w:jc w:val="both"/>
       </w:pPr>
       <w:r>
-        <w:t xml:space="preserve">Restricting the analysis to the flows a SOC would actually scrutinise — the bottom quintile of confidence, which contains 182 of the 184 total errors (98.9%) — divergence's relationship with error flips to the intuitive direction and is highly significant (mean divergence 0.265 on errors vs. 0.228 on correct predictions, p = 2.9 × 10⁻¹³; standalone AUROC 0.666). Confidence, however, remains substantially more discriminative even here (AUROC 0.930), and a logistic model combining both signals performs worse than confidence alone under 5-fold cross-validation (0.930 ± 0.025 vs. 0.875 ± 0.012) — a robust effect, not an artefact of the smaller within-quintile sample. Divergence therefore carries genuine, statistically defensible information about error risk specifically among ambiguous flows, consistent with a shared-artefact interpretation of low-divergence-yet-wrong cases (Section 4.5's second caveat), but it does not improve on the ensemble's own confidence score as a triage instrument.</w:t>
+        <w:t xml:space="preserve">Within the flows a SOC would actually scrutinise (the bottom quintile of confidence, which contains 182 of the 184 total errors, 98.9%), divergence's relationship with error flips to the intuitive direction and is highly significant (mean divergence 0.265 on errors vs. 0.228 on correct predictions, p = 2.9 × 10⁻¹³; standalone AUROC 0.666). Confidence, however, remains substantially more discriminative even here (AUROC 0.930), and a logistic model combining both signals performs worse than confidence alone under 5-fold cross-validation (0.930 ± 0.025 vs. 0.875 ± 0.012). This is a robust effect, not an artefact of the smaller within-quintile sample. Divergence therefore carries genuine, statistically defensible information about error risk specifically among ambiguous flows, consistent with a shared-artefact interpretation of low-divergence-yet-wrong cases (Section 4.5's second caveat), but it does not improve on the ensemble's own confidence score as a triage instrument.</w:t>
       </w:r>
     </w:p>
     <w:p>
@@ -12640,7 +12640,7 @@
         <w:jc w:val="both"/>
       </w:pPr>
       <w:r>
-        <w:t xml:space="preserve">Novel-attack (zero-day-like) detection. We separately tested whether divergence flags flows from an attack type excluded entirely from training — a realistic proxy for a genuinely new attack a deployed system has never seen. One class at a time (PortScan, DDoS, SSH-Patator, Web Attack — Brute Force) was withheld from training; the remaining eleven were used to fit a fresh ensemble, and both confidence and divergence were evaluated on the held-out class's flows against in-distribution test flows. The result is class-dependent rather than uniform (Table 9 below), and does not support a general claim that divergence outperforms confidence for novelty detection.</w:t>
+        <w:t xml:space="preserve">Novel-attack (zero-day-like) detection. We separately tested whether divergence flags flows from an attack type excluded entirely from training, a realistic proxy for a genuinely new attack a deployed system has never seen. One class at a time (PortScan, DDoS, SSH-Patator, Web Attack - Brute Force) was withheld from training; the remaining eleven were used to fit a fresh ensemble, and both confidence and divergence were evaluated on the held-out class's flows against in-distribution test flows. The result is class-dependent rather than uniform (Table 9 below), and does not support a general claim that divergence outperforms confidence for novelty detection.</w:t>
       </w:r>
     </w:p>
     <w:p>
@@ -13041,7 +13041,7 @@
               <w:jc w:val="center"/>
             </w:pPr>
             <w:r>
-              <w:t>Web Attack — Brute Force</w:t>
+              <w:t>Web Attack - Brute Force</w:t>
             </w:r>
           </w:p>
         </w:tc>
@@ -13121,7 +13121,7 @@
         <w:jc w:val="both"/>
       </w:pPr>
       <w:r>
-        <w:t xml:space="preserve">Repeating the per-alert error-prediction design of Section 4.5.3 on UNSW-NB15 (accuracy 0.8131, consistent with Section 4.7) does not replicate the CICIDS-2017 result — it reverses key parts of it. At the population level, divergence is now higher on errors (0.214 vs. 0.185, p = 2.0 × 10⁻⁸³; AUROC 0.585, above chance rather than below), and the underlying confidence–divergence correlation is negative here (ρ = −0.181, p = 3.5 × 10⁻¹³⁰) rather than positive as on CICIDS-2017 — the sign of the confound itself is dataset-dependent. Within UNSW-NB15's low-confidence regime (33.7% of all errors), confidence is markedly weaker than on CICIDS-2017 (AUROC 0.609 vs. 0.930), and combining confidence with divergence gives a modest, direction-consistent improvement under cross-validation (0.610 ± 0.047 → 0.655 ± 0.045), though the gain sits within roughly one standard deviation of the cross-validation noise and should not be over-read.</w:t>
+        <w:t xml:space="preserve">Repeating the per-alert error-prediction design of Section 4.5.3 on UNSW-NB15 (accuracy 0.8131, consistent with Section 4.7) does not replicate the CICIDS-2017 result. It reverses key parts of it. At the population level, divergence is now higher on errors (0.214 vs. 0.185, p = 2.0 × 10⁻⁸³; AUROC 0.585, above chance rather than below), and the underlying confidence–divergence correlation is negative here (ρ = −0.181, p = 3.5 × 10⁻¹³⁰) rather than positive as on CICIDS-2017. The sign of the confound itself is dataset-dependent. Within UNSW-NB15's low-confidence regime (33.7% of all errors), confidence is markedly weaker than on CICIDS-2017 (AUROC 0.609 vs. 0.930), and combining confidence with divergence gives a modest, direction-consistent improvement under cross-validation (0.610 ± 0.047 → 0.655 ± 0.045), though the gain sits within roughly one standard deviation of the cross-validation noise and should not be over-read.</w:t>
       </w:r>
     </w:p>
     <w:p>
@@ -13130,7 +13130,7 @@
         <w:jc w:val="both"/>
       </w:pPr>
       <w:r>
-        <w:t xml:space="preserve">Taken together with Section 4.5.3, we conclude that cross-model explanation agreement, and its inverse (divergence), do not behave as a stable, transferable property of this architecture: the sign and magnitude of every tested relationship changed between an in-distribution and an out-of-distribution scenario, between held-out attack classes, and between the two benchmark datasets. We report this as the honest outcome of a deliberately rigorous test — using a paired baseline, proper statistical tests, cross-validation, bootstrap confidence intervals, multi-class replication, and cross-dataset replication, a level of scrutiny largely absent from prior explanation-consistency claims in this literature (Section 2.1) — rather than retreat to a narrower claim that would not survive the same scrutiny.</w:t>
+        <w:t xml:space="preserve">Taken together with Section 4.5.3, we conclude that cross-model explanation agreement, and its inverse (divergence), do not behave as a stable, transferable property of this architecture: the sign and magnitude of every tested relationship changed between an in-distribution and an out-of-distribution scenario, between held-out attack classes, and between the two benchmark datasets. We report this as the honest outcome of a deliberately rigorous test, using a paired baseline, proper statistical tests, cross-validation, bootstrap confidence intervals, multi-class replication, and cross-dataset replication (a level of scrutiny largely absent from prior explanation-consistency claims in this literature, Section 2.1), rather than retreat to a narrower claim that would not survive the same scrutiny.</w:t>
       </w:r>
     </w:p>
     <w:p>
@@ -14969,7 +14969,7 @@
         <w:t xml:space="preserve">Threshold calibration is markedly more impactful on the harder benchmark. </w:t>
       </w:r>
       <w:r>
-        <w:t>Where CICIDS-2017's well-separated classes left little room for decision-layer tuning, UNSW-NB15's overlapping classes show class-specific calibration effects (Table 11): Analysis precision rose sharply from 0.12 to 0.39 and false alarms fell from 992.3 to 166.5 per 100,000 flows (an 83% reduction), the dominant improvement. Backdoor false alarms fell modestly from 759.5 to 686.9 per 100,000 flows while Backdoor recall improved (0.115→0.139) — unlike Analysis, whose recall fell (0.131→0.103) as precision rose. Worms and Shellcode each showed smaller false-alarm reductions. Macro-F1 improved slightly (pooled predictions: 0.5814→0.5839; fold-averaged, as in Table 10: 0.5817→0.5840), while balanced accuracy decreased (0.5860→0.5754) due to the recall-for-precision trade on Analysis. Whether this trade is operationally acceptable depends on the priority assigned to these attack classes in the deployment context; the calibration thresholds are adjustable per operator preference, which is precisely the operational flexibility the leak-free calibration mechanism provides.</w:t>
+        <w:t>Where CICIDS-2017's well-separated classes left little room for decision-layer tuning, UNSW-NB15's overlapping classes show class-specific calibration effects (Table 11): Analysis precision rose sharply from 0.12 to 0.39 and false alarms fell from 992.3 to 166.5 per 100,000 flows (an 83% reduction), the dominant improvement. Backdoor false alarms fell modestly from 759.5 to 686.9 per 100,000 flows while Backdoor recall improved (0.115→0.139), unlike Analysis, whose recall fell (0.131→0.103) as precision rose. Worms and Shellcode each showed smaller false-alarm reductions. Macro-F1 improved slightly (pooled predictions: 0.5814→0.5839; fold-averaged, as in Table 10: 0.5817→0.5840), while balanced accuracy decreased (0.5860→0.5754) due to the recall-for-precision trade on Analysis. Whether this trade is operationally acceptable depends on the priority assigned to these attack classes in the deployment context; the calibration thresholds are adjustable per operator preference, which is precisely the operational flexibility the leak-free calibration mechanism provides.</w:t>
       </w:r>
     </w:p>
     <w:tbl>
@@ -16668,7 +16668,7 @@
         <w:t xml:space="preserve">Explanation-consistency: partial replication. </w:t>
       </w:r>
       <w:r>
-        <w:t xml:space="preserve">Under the same-sample protocol, Spearman ρ = 0.840 (p = 6.31×10⁻⁹) and Kendall τ = 0.632 on UNSW-NB15, stronger than CICIDS-2017 (ρ = 0.775). Top-10 feature agreement is 0.9 on CICIDS-2017 and 0.8 on UNSW-NB15 (Table 12). However, top-5 feature agreement falls to 0.4 on UNSW (vs 0.6 on CICIDS), and top-5 positional rank agreement is 0.2 and top-10 rank agreement is 0.1 on UNSW (vs 0.6 and 0.3 on CICIDS, respectively). The weaker rank metrics on UNSW reflect higher co-linearity among Argus/Zeek flow statistics: connection-count features (ct_src_dport_ltm, ct_dst_src_ltm) dominate EBM contributions but not SHAP attributions, and an additive GAM redistributes these across correlated main effects differently from Shapley values. The result is nuanced: the raw correlation is significant and somewhat stronger on both benchmarks than a chance baseline, but positional rank agreement does not generalise across feature-extractor families, and — as Section 4.5.3-4.5.4 shows directly — this magnitude of agreement does not translate into a usable operational trust signal on either benchmark. We therefore stop short of recommending SHAP-vs-glass-box consistency checks as a deployable practice per se; Section 4.5.3-4.5.4 details what was actually tested and found.</w:t>
+        <w:t xml:space="preserve">Under the same-sample protocol, Spearman ρ = 0.840 (p = 6.31×10⁻⁹) and Kendall τ = 0.632 on UNSW-NB15, stronger than CICIDS-2017 (ρ = 0.775). Top-10 feature agreement is 0.9 on CICIDS-2017 and 0.8 on UNSW-NB15 (Table 12). However, top-5 feature agreement falls to 0.4 on UNSW (vs 0.6 on CICIDS), and top-5 positional rank agreement is 0.2 and top-10 rank agreement is 0.1 on UNSW (vs 0.6 and 0.3 on CICIDS, respectively). The weaker rank metrics on UNSW reflect higher co-linearity among Argus/Zeek flow statistics: connection-count features (ct_src_dport_ltm, ct_dst_src_ltm) dominate EBM contributions but not SHAP attributions, and an additive GAM redistributes these across correlated main effects differently from Shapley values. The result is nuanced: the raw correlation is significant and somewhat stronger on both benchmarks than a chance baseline, but positional rank agreement does not generalise across feature-extractor families. As Section 4.5.3-4.5.4 shows directly, this magnitude of agreement does not translate into a usable operational trust signal on either benchmark. We therefore stop short of recommending SHAP-vs-glass-box consistency checks as a deployable practice per se; Section 4.5.3-4.5.4 details what was actually tested and found.</w:t>
       </w:r>
     </w:p>
     <w:tbl>
@@ -18452,7 +18452,7 @@
           <w:sz w:val="18"/>
           <w:szCs w:val="18"/>
         </w:rPr>
-        <w:t>Table 14. Positioning summary — related works on UNSW-NB15. Moustafa and Slay (2015) is a dataset introduction paper with no classification results. Binary-classification result (Al-Omari and Al-Haija (2024)) is not directly comparable to our 10-class setup.</w:t>
+        <w:t>Table 14. Positioning summary: related works on UNSW-NB15. Moustafa and Slay (2015) is a dataset introduction paper with no classification results. Binary-classification result (Al-Omari and Al-Haija (2024)) is not directly comparable to our 10-class setup.</w:t>
       </w:r>
     </w:p>
     <w:tbl>
@@ -19108,7 +19108,7 @@
         <w:jc w:val="both"/>
       </w:pPr>
       <w:r>
-        <w:t>This work set out to make the explanations a deployed NIDS delivers to its operators checkable, and to show that the check can be built into the system itself. Embedding the glass-box EBM as a deployed base learner enabled a direct empirical test of whether cross-model explanation agreement functions as an operational trust signal — a claim implicit in prior explanation-consistency proposals (Section 2.1) but, to our knowledge, not previously tested against a confidence baseline with proper statistics. It does not: across in-distribution error prediction (Section 4.5.3), out-of-distribution novelty detection across four held-out attack classes (Section 4.5.3), and cross-dataset replication on UNSW-NB15 (Section 4.5.4), the sign and usefulness of the divergence signal varied by scenario and dataset, and a well-calibrated confidence score already available from the stacking meta-learner outperformed it in the large majority of tested conditions. We report this as a rigorously-tested negative result rather than retreat to a narrower positive claim: it corrects an intuitive but unverified assumption in the explainable-IDS literature, using statistical machinery (paired DeLong tests, cross-validated incremental AUROC, bootstrap confidence intervals, multi-class and cross-dataset replication) more thorough than is typical for this kind of claim, and it surfaces two independently useful findings along the way — that CICIDS-2017's day-siloed attack structure precludes naive temporal-split evaluation (Section 5), and that single-point explanation-agreement estimates carry meaningful refit-to-refit variability that background-sampling bootstrap confidence intervals alone do not capture (Section 4.5). The detection engineering underneath the framework began from a negative result: a conventional XGBoost+LightGBM+Random-Forest voting ensemble could not beat its own best member. That result was converted into an architecture: three structurally different learners (CatBoost, ExtraTrees, EBM) combined by stacked generalisation under a leak-proof, fully paired evaluation. The stacked ensemble reaches 99.83% accuracy (weighted F1 0.9984, MCC 0.9951), significantly outperforming its best base member and a strong LightGBM reference (28.1% relative error reduction), where soft voting fails both tests. Inter-arrival-time features emerged as the binding constraint on web-attack detection in the feature-count ablation (worth 4–5× in minority F1, more than any resampling strategy, though not isolated by a controlled single-group ablation), and real-prevalence threshold calibration gives operators an inspectable false-alarm dial with a statistically significant net accuracy benefit. At 4.33 µs parallel inference on CICIDS-2017 (29.8 µs on UNSW-NB15), the system meets real-time requirements on commodity hardware. Critically, the diversity-driven mechanism, the stacking advantage, and the threshold-calibration benefit all replicate under native retraining on UNSW-NB15, a benchmark built by a different feature-extraction toolchain, evidence that these contributions are not specific to a single feature-extraction toolchain; the raw SHAP-EBM correlation itself also strengthens there (ρ = 0.840), even though, as Section 4.5.4 shows, the operational usefulness of that divergence as a trust signal does not transfer in the same direction — a further instance of the dissociation between raw agreement and demonstrated usefulness this paper documents throughout. The CICIDS-2017 macro-F1 of 0.8982 reflects the global feature-ranking pipeline used throughout; in-fold feature ranking, tested as a leakage-control experiment in Section 5, yields a conservative estimate of 0.8625, with 85% feature overlap per fold and no effect on any comparative conclusion or the stacking advantage. Together, these results argue that explanation-consistent intrusion detection is achieved not by attaching explanations to an accurate black box, but by building ensembles whose accuracy and explanation consistency are evaluated within the same architecture.</w:t>
+        <w:t>This work set out to make the explanations a deployed NIDS delivers to its operators checkable, and to show that the check can be built into the system itself. Embedding the glass-box EBM as a deployed base learner enabled a direct empirical test of whether cross-model explanation agreement functions as an operational trust signal, a claim implicit in prior explanation-consistency proposals (Section 2.1) but, to our knowledge, not previously tested against a confidence baseline with proper statistics. It does not: across in-distribution error prediction (Section 4.5.3), out-of-distribution novelty detection across four held-out attack classes (Section 4.5.3), and cross-dataset replication on UNSW-NB15 (Section 4.5.4), the sign and usefulness of the divergence signal varied by scenario and dataset, and a well-calibrated confidence score already available from the stacking meta-learner outperformed it in the large majority of tested conditions. We report this as a rigorously-tested negative result rather than retreat to a narrower positive claim: it corrects an intuitive but unverified assumption in the explainable-IDS literature, using statistical machinery (paired DeLong tests, cross-validated incremental AUROC, bootstrap confidence intervals, multi-class and cross-dataset replication) more thorough than is typical for this kind of claim, and it surfaces two independently useful findings along the way: that CICIDS-2017's day-siloed attack structure precludes naive temporal-split evaluation (Section 5), and that single-point explanation-agreement estimates carry meaningful refit-to-refit variability that background-sampling bootstrap confidence intervals alone do not capture (Section 4.5). The detection engineering underneath the framework began from a negative result: a conventional XGBoost+LightGBM+Random-Forest voting ensemble could not beat its own best member. That result was converted into an architecture: three structurally different learners (CatBoost, ExtraTrees, EBM) combined by stacked generalisation under a leak-proof, fully paired evaluation. The stacked ensemble reaches 99.83% accuracy (weighted F1 0.9984, MCC 0.9951), significantly outperforming its best base member and a strong LightGBM reference (28.1% relative error reduction), where soft voting fails both tests. Inter-arrival-time features emerged as the binding constraint on web-attack detection in the feature-count ablation (worth 4–5× in minority F1, more than any resampling strategy, though not isolated by a controlled single-group ablation), and real-prevalence threshold calibration gives operators an inspectable false-alarm dial with a statistically significant net accuracy benefit. At 4.33 µs parallel inference on CICIDS-2017 (29.8 µs on UNSW-NB15), the system meets real-time requirements on commodity hardware. Critically, the diversity-driven mechanism, the stacking advantage, and the threshold-calibration benefit all replicate under native retraining on UNSW-NB15, a benchmark built by a different feature-extraction toolchain, evidence that these contributions are not specific to a single feature-extraction toolchain; the raw SHAP-EBM correlation itself also strengthens there (ρ = 0.840), even though, as Section 4.5.4 shows, the operational usefulness of that divergence as a trust signal does not transfer in the same direction, a further instance of the dissociation between raw agreement and demonstrated usefulness this paper documents throughout. The CICIDS-2017 macro-F1 of 0.8982 reflects the global feature-ranking pipeline used throughout; in-fold feature ranking, tested as a leakage-control experiment in Section 5, yields a conservative estimate of 0.8625, with 85% feature overlap per fold and no effect on any comparative conclusion or the stacking advantage. Together, these results argue that explanation-consistent intrusion detection is achieved not by attaching explanations to an accurate black box, but by building ensembles whose accuracy and explanation consistency are evaluated within the same architecture.</w:t>
       </w:r>
     </w:p>
     <w:p>

</xml_diff>